<commit_message>
Punto 5: cursos de temporada del archivo CA y diplomado de articulación; informe actualizado con las decisiones de la comisión
Co-Authored-By: Claude Opus 5.5 <noreply@anthropic.com>
Claude-Session: https://claude.ai/code/session_01Li7yxA95TVg4oPXuqG5DZe
</commit_message>
<xml_diff>
--- a/rediseno_2026/Ajustes y observaciones - puntos 5, 8 y 11/5. Admisión promoción y graduación.docx
+++ b/rediseno_2026/Ajustes y observaciones - puntos 5, 8 y 11/5. Admisión promoción y graduación.docx
@@ -2102,15 +2102,12 @@
         </w:tabs>
         <w:spacing w:before="80" w:after="200"/>
         <w:ind w:left="709" w:hanging="709"/>
-        <w:rPr>
-          <w:highlight w:val="yellow"/>
-        </w:rPr>
+        <w:rPr/>
       </w:pPr>
       <w:r>
         <w:rPr>
           <w:b/>
           <w:sz w:val="22"/>
-          <w:highlight w:val="yellow"/>
         </w:rPr>
         <w:t>5.3.3</w:t>
       </w:r>
@@ -2118,7 +2115,6 @@
         <w:rPr>
           <w:b/>
           <w:sz w:val="22"/>
-          <w:highlight w:val="yellow"/>
         </w:rPr>
         <w:tab/>
         <w:t>Cursos intensivos de temporada</w:t>
@@ -2128,15 +2124,22 @@
       <w:pPr>
         <w:spacing w:after="200"/>
         <w:jc w:val="both"/>
-        <w:rPr>
-          <w:highlight w:val="yellow"/>
-        </w:rPr>
-      </w:pPr>
-      <w:r>
-        <w:rPr>
-          <w:highlight w:val="yellow"/>
-        </w:rPr>
-        <w:t>Se rigen por la Resolución HCU N.º 093/2006, de 15 de marzo de 2006. Su Artículo 13 establece que «las Carreras tienen la tuición de elegir las materias a ser dictadas en el periodo que dure los Cursos de Temporada en función de aspectos que cada unidad académica considere importante, debiendo sus contenidos ser cubiertos en un 100% en teoría y en práctica», y su Artículo 6 dispone que, en las carreras anualizadas, cada curso se desarrolle en forma intensiva al finalizar la gestión por un lapso mínimo de 60 días calendario, ocho semanas, con la carga horaria suficiente para desarrollar la totalidad del programa analítico. La resolución no prohíbe ofertar asignaturas troncales, sino que otorga a cada carrera la potestad de seleccionar las asignaturas que se dictan.</w:t>
+        <w:rPr/>
+      </w:pPr>
+      <w:r>
+        <w:rPr/>
+        <w:t xml:space="preserve">Normados por la Resolución HCU Nº 093/2006 Reglamento de Cursos de Temporada de la UMSA, de 15 de marzo de 2006 que en su Artículo 13º establece que: “Las Carreras tienen la tuición de elegir las materias a ser dictadas en el periodo que dure los Cursos de Temporada en función de aspectos que cada unidad académica considere importante, debiendo sus contenidos ser cubiertos en un 100% en teoría y en práctica”.</w:t>
+      </w:r>
+    </w:p>
+    <w:p>
+      <w:pPr>
+        <w:spacing w:after="200"/>
+        <w:jc w:val="both"/>
+        <w:rPr/>
+      </w:pPr>
+      <w:r>
+        <w:rPr/>
+        <w:t xml:space="preserve">Así mismo, el Artículo 6º de dicha norma establece que: “Cada curso se desarrollará en forma intensiva … al finalizar la gestión en caso de carreras anualizadas por un lapso de 60 días calendario (8 semanas) mínimamente, equivalente a la carga horaria suficiente para desarrollar la totalidad de su programa analítico en vigencia…”.</w:t>
       </w:r>
     </w:p>
     <w:p>
@@ -2147,22 +2150,17 @@
         </w:numPr>
         <w:spacing w:after="160"/>
         <w:jc w:val="both"/>
-        <w:rPr>
-          <w:highlight w:val="yellow"/>
-        </w:rPr>
+        <w:rPr/>
       </w:pPr>
       <w:r>
         <w:rPr>
           <w:b/>
-          <w:highlight w:val="yellow"/>
         </w:rPr>
-        <w:t>Propósito:</w:t>
-      </w:r>
-      <w:r>
-        <w:rPr>
-          <w:highlight w:val="yellow"/>
-        </w:rPr>
-        <w:t xml:space="preserve"> ofrecer a los estudiantes regulares la opción de cursar en forma intensiva, para nivelar o adelantar hasta dos asignaturas por temporada, con cumplimiento de los requisitos y prerrequisitos del plan de estudios y de los reglamentos facultativos.</w:t>
+        <w:t xml:space="preserve">Propósito:</w:t>
+      </w:r>
+      <w:r>
+        <w:rPr/>
+        <w:t xml:space="preserve"> Ofrecer a los estudiantes regulares de la Carrera, la opción de cursar en un periodo intensivo en cada temporada, para nivelar o adelantar hasta dos asignaturas, cumpliendo los requisitos y pre-requisitos establecidos en los planes de estudio y reglamentos facultativos.</w:t>
       </w:r>
     </w:p>
     <w:p>
@@ -2173,22 +2171,17 @@
         </w:numPr>
         <w:spacing w:after="160"/>
         <w:jc w:val="both"/>
-        <w:rPr>
-          <w:highlight w:val="yellow"/>
-        </w:rPr>
+        <w:rPr/>
       </w:pPr>
       <w:r>
         <w:rPr>
           <w:b/>
-          <w:highlight w:val="yellow"/>
         </w:rPr>
-        <w:t>Asignaturas habilitadas:</w:t>
-      </w:r>
-      <w:r>
-        <w:rPr>
-          <w:highlight w:val="yellow"/>
-        </w:rPr>
-        <w:t xml:space="preserve"> las 14 asignaturas de las áreas contextuales de Administración, Derecho, Economía y Matemáticas, y las troncales de 80 horas anuales: CPA-102, CPA-204, CPA-406, CPA-506, CPA-507, CPA-508, CPA-509 y CPA-510.</w:t>
+        <w:t xml:space="preserve">Alcance por Áreas:</w:t>
+      </w:r>
+      <w:r>
+        <w:rPr/>
+        <w:t xml:space="preserve"> Aplicable sin restricciones para todas las Asignaturas Contextuales (14 materias de Administración, Derecho, Economía y Matemáticas) y para las Asignaturas Troncales con una carga horaria igual o menor a 80 horas anuales (CPA-102, CPA-204, CPA-406, CPA-506, CPA-507, CPA-508, CPA-509 y CPA-510).</w:t>
       </w:r>
     </w:p>
     <w:p>
@@ -2199,55 +2192,17 @@
         </w:numPr>
         <w:spacing w:after="160"/>
         <w:jc w:val="both"/>
-        <w:rPr>
-          <w:highlight w:val="yellow"/>
-        </w:rPr>
+        <w:rPr/>
       </w:pPr>
       <w:r>
         <w:rPr>
           <w:b/>
-          <w:highlight w:val="yellow"/>
         </w:rPr>
-        <w:t>Recuperación de troncales:</w:t>
-      </w:r>
-      <w:r>
-        <w:rPr>
-          <w:highlight w:val="yellow"/>
-        </w:rPr>
-        <w:t xml:space="preserve"> las asignaturas troncales de 160 horas anuales pueden cursarse en temporada solo para recuperar una asignatura reprobada. Se elimina el requisito vigente de haber obtenido al menos 20 puntos sobre 100 en la gestión regular, y el estudiante </w:t>
-      </w:r>
-      <w:r>
-        <w:rPr>
-          <w:highlight w:val="yellow"/>
-        </w:rPr>
-        <w:lastRenderedPageBreak/>
-        <w:t>reprobado accede a la recuperación con un esquema de tutoría complementaria obligatoria.</w:t>
-      </w:r>
-    </w:p>
-    <w:p>
-      <w:pPr>
-        <w:numPr>
-          <w:ilvl w:val="0"/>
-          <w:numId w:val="14"/>
-        </w:numPr>
-        <w:spacing w:after="200"/>
-        <w:jc w:val="both"/>
-        <w:rPr>
-          <w:highlight w:val="yellow"/>
-        </w:rPr>
-      </w:pPr>
-      <w:r>
-        <w:rPr>
-          <w:b/>
-          <w:highlight w:val="yellow"/>
-        </w:rPr>
-        <w:t>Modalidad híbrida:</w:t>
-      </w:r>
-      <w:r>
-        <w:rPr>
-          <w:highlight w:val="yellow"/>
-        </w:rPr>
-        <w:t xml:space="preserve"> el Honorable Consejo de Carrera podrá habilitar progresivamente asignaturas troncales en modalidad presencial y virtual, siempre que se cubra la totalidad del programa.</w:t>
+        <w:t xml:space="preserve">Condición de Recuperación:</w:t>
+      </w:r>
+      <w:r>
+        <w:rPr/>
+        <w:t xml:space="preserve"> Para asignaturas troncales con carga horaria superior a 80 horas, el estudiante podrá acceder a curso de verano únicamente en calidad de recuperación de materia reprobada, habiendo obtenido una nota previa igual o mayor a treinta (30) sobre cien (100) puntos en la gestión ordinaria previa.</w:t>
       </w:r>
     </w:p>
     <w:p>
@@ -5103,12 +5058,34 @@
       <w:pPr>
         <w:spacing w:after="200"/>
         <w:jc w:val="both"/>
+        <w:rPr>
+          <w:highlight w:val="yellow"/>
+        </w:rPr>
+      </w:pPr>
+      <w:r>
+        <w:rPr>
+          <w:b/>
+          <w:highlight w:val="yellow"/>
+        </w:rPr>
+        <w:t xml:space="preserve">f. Articulación grado - posgrado (monografía o examen vía diplomado).</w:t>
+      </w:r>
+      <w:r>
+        <w:rPr>
+          <w:highlight w:val="yellow"/>
+        </w:rPr>
+        <w:t xml:space="preserve"> Conforme a las normativas vigentes del SUB, mediante el Título IV (Artículos 82 al 95) del Reglamento General de Estudios de Posgrado del Sistema de la Universidad Boliviana y el Reglamento General de Posgrado, el estudiante de Quinto Año o egresado puede cursar un Programa de Diplomado Acreditado, el cual debe contar con la aprobación del Consejo Facultativo y acreditar una carga horaria total de 800 horas académicas (20 créditos): distribuidas en 240 horas lectivas presenciales y 560 horas de investigación/prácticas aplicadas; en áreas de especialización contable o de aseguramiento y obtener la titulación mediante la aprobación de una Monografía (Desarrollo y defensa de un estudio exhaustivo de investigación aplicada bajo la guía de un tutor/docente sobre un tema del diplomado), un Examen de Contenidos del posgrado (Evaluación teórico-práctica sobre las competencias del programa posgradual y su articulación con el pregrado) o Graduación por Excelencia en el Diplomado (otorgada al cursante con desempeño cuali-cuantitativo sobresaliente en los módulos del programa).</w:t>
+      </w:r>
+    </w:p>
+    <w:p>
+      <w:pPr>
+        <w:spacing w:after="200"/>
+        <w:jc w:val="both"/>
       </w:pPr>
       <w:r>
         <w:rPr>
           <w:b/>
         </w:rPr>
-        <w:t>f</w:t>
+        <w:t>g</w:t>
       </w:r>
       <w:r>
         <w:rPr>

</xml_diff>

<commit_message>
Punto 5: perfil del estudiante universitario y perfil y requisitos del docente, copiados del archivo 04 CA
Co-Authored-By: Claude Opus 5.5 <noreply@anthropic.com>
Claude-Session: https://claude.ai/code/session_01Li7yxA95TVg4oPXuqG5DZe
</commit_message>
<xml_diff>
--- a/rediseno_2026/Ajustes y observaciones - puntos 5, 8 y 11/5. Admisión promoción y graduación.docx
+++ b/rediseno_2026/Ajustes y observaciones - puntos 5, 8 y 11/5. Admisión promoción y graduación.docx
@@ -159,6 +159,895 @@
       </w:pPr>
       <w:r>
         <w:t>El diagnóstico identifica una brecha entre las competencias del bachiller promedio y las exigencias de la Carrera, especialmente en competencias digitales, manejo de hojas de cálculo, pensamiento analítico y nociones contables, que el nuevo plan atiende mediante la evaluación diagnóstica y la nivelación descritas en el punto 5.2.</w:t>
+      </w:r>
+    </w:p>
+    <w:p>
+      <w:pPr>
+        <w:keepNext/>
+        <w:spacing w:before="80" w:after="200"/>
+      </w:pPr>
+      <w:r>
+        <w:rPr>
+          <w:b/>
+          <w:sz w:val="22"/>
+          <w:szCs w:val="22"/>
+        </w:rPr>
+        <w:t xml:space="preserve">Perfil del Estudiante Universitario</w:t>
+      </w:r>
+    </w:p>
+    <w:p>
+      <w:pPr>
+        <w:spacing w:after="200"/>
+        <w:jc w:val="both"/>
+      </w:pPr>
+      <w:r>
+        <w:rPr/>
+        <w:t xml:space="preserve">El estudiante en proceso de formación en la Carrera de Contaduría Pública asume el rol de </w:t>
+      </w:r>
+      <w:r>
+        <w:rPr>
+          <w:b/>
+        </w:rPr>
+        <w:t xml:space="preserve">constructor activo de su propio aprendizaje</w:t>
+      </w:r>
+      <w:r>
+        <w:rPr/>
+        <w:t xml:space="preserve">, demostrando durante su permanencia académica:</w:t>
+      </w:r>
+    </w:p>
+    <w:p>
+      <w:pPr>
+        <w:numPr>
+          <w:ilvl w:val="0"/>
+          <w:numId w:val="10"/>
+        </w:numPr>
+        <w:spacing w:after="160"/>
+        <w:jc w:val="both"/>
+      </w:pPr>
+      <w:r>
+        <w:rPr>
+          <w:b/>
+        </w:rPr>
+        <w:t xml:space="preserve">Desempeño Académico e Investigación:</w:t>
+      </w:r>
+      <w:r>
+        <w:rPr/>
+        <w:t xml:space="preserve"> Capacidad analítica y crítica en el abordaje de las asignaturas, participación activa en proyectos de investigación formativa (metodología ABP), espíritu de autoaprendizaje y constante actualización normativa y tecnológica.</w:t>
+      </w:r>
+    </w:p>
+    <w:p>
+      <w:pPr>
+        <w:numPr>
+          <w:ilvl w:val="0"/>
+          <w:numId w:val="10"/>
+        </w:numPr>
+        <w:spacing w:after="160"/>
+        <w:jc w:val="both"/>
+      </w:pPr>
+      <w:r>
+        <w:rPr>
+          <w:b/>
+        </w:rPr>
+        <w:t xml:space="preserve">Competencia Digital e Innovación:</w:t>
+      </w:r>
+      <w:r>
+        <w:rPr/>
+        <w:t xml:space="preserve"> Disposición activa para el manejo de herramientas tecnológicas, software contable, sistemas ERP, herramientas de análisis de datos e Inteligencia Artificial aplicadas a la solución de casos reales.</w:t>
+      </w:r>
+    </w:p>
+    <w:p>
+      <w:pPr>
+        <w:numPr>
+          <w:ilvl w:val="0"/>
+          <w:numId w:val="10"/>
+        </w:numPr>
+        <w:spacing w:after="160"/>
+        <w:jc w:val="both"/>
+      </w:pPr>
+      <w:r>
+        <w:rPr>
+          <w:b/>
+        </w:rPr>
+        <w:t xml:space="preserve">Cultura Ética y Ciudadana:</w:t>
+      </w:r>
+      <w:r>
+        <w:rPr/>
+        <w:t xml:space="preserve"> Ejercicio estricto del juicio profesional independiente, vivencia de los valores éticos (honestidad, objetividad y confidencialidad), respeto a la diversidad socio-cultural, liderazgo adaptativo y compromiso con la interacción social universitaria.</w:t>
+      </w:r>
+    </w:p>
+    <w:p>
+      <w:pPr>
+        <w:keepNext/>
+        <w:spacing w:before="80" w:after="200"/>
+      </w:pPr>
+      <w:r>
+        <w:rPr>
+          <w:b/>
+          <w:sz w:val="22"/>
+          <w:szCs w:val="22"/>
+        </w:rPr>
+        <w:t xml:space="preserve">Perfil y Requisitos Profesionales del Docente Universitario</w:t>
+      </w:r>
+    </w:p>
+    <w:p>
+      <w:pPr>
+        <w:spacing w:after="200"/>
+        <w:jc w:val="both"/>
+      </w:pPr>
+      <w:r>
+        <w:rPr/>
+        <w:t xml:space="preserve">Para garantizar la calidad académica, el rigor científico y la idoneidad pedagógica en la ejecución del </w:t>
+      </w:r>
+      <w:r>
+        <w:rPr>
+          <w:b/>
+        </w:rPr>
+        <w:t xml:space="preserve">Plan de Estudios 2027 (CPA)</w:t>
+      </w:r>
+      <w:r>
+        <w:rPr/>
+        <w:t xml:space="preserve">, la Carrera de Contaduría Pública de la UMSA define el perfil integral y las especificaciones técnicas requeridas para el cuerpo docente por área del conocimiento, en cumplimiento del </w:t>
+      </w:r>
+      <w:r>
+        <w:rPr>
+          <w:b/>
+        </w:rPr>
+        <w:t xml:space="preserve">Reglamento del Régimen Académico Docente de la UMSA</w:t>
+      </w:r>
+      <w:r>
+        <w:rPr/>
+        <w:t xml:space="preserve">, los estándares de acreditación del </w:t>
+      </w:r>
+      <w:r>
+        <w:rPr>
+          <w:b/>
+        </w:rPr>
+        <w:t xml:space="preserve">Comité Ejecutivo de la Universidad Boliviana (CEUB)</w:t>
+      </w:r>
+      <w:r>
+        <w:rPr/>
+        <w:t xml:space="preserve"> y las Normas </w:t>
+      </w:r>
+      <w:r>
+        <w:rPr>
+          <w:b/>
+        </w:rPr>
+        <w:t xml:space="preserve">IES 2 e IES 4 de la IFAC.</w:t>
+      </w:r>
+    </w:p>
+    <w:p>
+      <w:pPr>
+        <w:keepNext/>
+        <w:spacing w:before="80" w:after="200"/>
+      </w:pPr>
+      <w:r>
+        <w:rPr>
+          <w:b/>
+          <w:sz w:val="20"/>
+          <w:szCs w:val="20"/>
+        </w:rPr>
+        <w:t xml:space="preserve">Requisitos generales de idoneidad y formación docente</w:t>
+      </w:r>
+    </w:p>
+    <w:p>
+      <w:pPr>
+        <w:spacing w:after="200"/>
+        <w:jc w:val="both"/>
+      </w:pPr>
+      <w:r>
+        <w:rPr/>
+        <w:t xml:space="preserve">El docente de la Carrera de Contaduría Pública es un facilitador, investigador y referente ético-profesional que reúne obligatoriamente los siguientes requisitos de idoneidad académica y profesional:</w:t>
+      </w:r>
+    </w:p>
+    <w:p>
+      <w:pPr>
+        <w:numPr>
+          <w:ilvl w:val="0"/>
+          <w:numId w:val="10"/>
+        </w:numPr>
+        <w:spacing w:after="160"/>
+        <w:jc w:val="both"/>
+      </w:pPr>
+      <w:r>
+        <w:rPr>
+          <w:b/>
+        </w:rPr>
+        <w:t xml:space="preserve">Formación Académica y Títulos:</w:t>
+      </w:r>
+      <w:r>
+        <w:rPr/>
+        <w:t xml:space="preserve"> Posee Diploma Académico de Licenciatura y Título Profesional / Título en Provisión Nacional expedido o revalidado por una Universidad del Sistema de la Universidad Boliviana (SUB).</w:t>
+      </w:r>
+    </w:p>
+    <w:p>
+      <w:pPr>
+        <w:numPr>
+          <w:ilvl w:val="0"/>
+          <w:numId w:val="10"/>
+        </w:numPr>
+        <w:spacing w:after="160"/>
+        <w:jc w:val="both"/>
+      </w:pPr>
+      <w:r>
+        <w:rPr>
+          <w:b/>
+        </w:rPr>
+        <w:t xml:space="preserve">Formación Pedagógica Obligatoria:</w:t>
+      </w:r>
+      <w:r>
+        <w:rPr/>
+        <w:t xml:space="preserve"> Acreditar un curso de Formación Docente en Educación Superior (mínimo nivel de Diplomado en Educación Superior o su equivalente reconocido por el SUB).</w:t>
+      </w:r>
+    </w:p>
+    <w:p>
+      <w:pPr>
+        <w:numPr>
+          <w:ilvl w:val="0"/>
+          <w:numId w:val="10"/>
+        </w:numPr>
+        <w:spacing w:after="160"/>
+        <w:jc w:val="both"/>
+      </w:pPr>
+      <w:r>
+        <w:rPr>
+          <w:b/>
+        </w:rPr>
+        <w:t xml:space="preserve">Experiencia Profesional Probada:</w:t>
+      </w:r>
+      <w:r>
+        <w:rPr/>
+        <w:t xml:space="preserve"> Demostrar experiencia práctica previa comprobable no menor a 3 años en el ejercicio efectivo de la profesión y en el área específica de la cátedra que imparte, garantizando la enseñanza fundamentada en casos y problemáticas reales.</w:t>
+      </w:r>
+    </w:p>
+    <w:p>
+      <w:pPr>
+        <w:numPr>
+          <w:ilvl w:val="0"/>
+          <w:numId w:val="10"/>
+        </w:numPr>
+        <w:spacing w:after="160"/>
+        <w:jc w:val="both"/>
+      </w:pPr>
+      <w:r>
+        <w:rPr>
+          <w:b/>
+        </w:rPr>
+        <w:t xml:space="preserve">Competencias Digitales e Innovación Pedagógica:</w:t>
+      </w:r>
+      <w:r>
+        <w:rPr/>
+        <w:t xml:space="preserve"> Maneja con fluidez entornos virtuales de aprendizaje, herramientas tecnológicas aplicadas (software contable, sistemas ERP, paquetes de análisis de datos e Inteligencia Artificial), domina metodologías activas de aprendizaje (casos, proyectos, simulación) y diseña estrategias de evaluación auténtica (rúbricas, portafolios y proyectos integradores). </w:t>
+      </w:r>
+    </w:p>
+    <w:p>
+      <w:pPr>
+        <w:numPr>
+          <w:ilvl w:val="0"/>
+          <w:numId w:val="10"/>
+        </w:numPr>
+        <w:spacing w:after="160"/>
+        <w:jc w:val="both"/>
+      </w:pPr>
+      <w:r>
+        <w:rPr>
+          <w:b/>
+        </w:rPr>
+        <w:t xml:space="preserve">Cultura Ética y Ejemplaridad:</w:t>
+      </w:r>
+      <w:r>
+        <w:rPr/>
+        <w:t xml:space="preserve"> Demuestra conducta ética intachable, independencia de criterio y alineamiento con los principios del Código Internacional de Ética del IESBA y el Estatuto Orgánico de la UMSA.</w:t>
+      </w:r>
+    </w:p>
+    <w:p>
+      <w:pPr>
+        <w:numPr>
+          <w:ilvl w:val="0"/>
+          <w:numId w:val="10"/>
+        </w:numPr>
+        <w:spacing w:after="160"/>
+        <w:jc w:val="both"/>
+      </w:pPr>
+      <w:r>
+        <w:rPr>
+          <w:b/>
+        </w:rPr>
+        <w:t xml:space="preserve">Formación de Posgrado y Acreditación:</w:t>
+      </w:r>
+      <w:r>
+        <w:rPr/>
+        <w:t xml:space="preserve"> En alineación con los estándares de acreditación universitaria (CEUB), al menos el 51% del plantel docente debe contar con grado académico de Posgrado (Especialidad, Maestría o Doctorado) en el área de conocimiento de su cátedra.</w:t>
+      </w:r>
+    </w:p>
+    <w:p>
+      <w:pPr>
+        <w:keepNext/>
+        <w:spacing w:before="80" w:after="200"/>
+      </w:pPr>
+      <w:r>
+        <w:rPr>
+          <w:b/>
+          <w:sz w:val="20"/>
+          <w:szCs w:val="20"/>
+        </w:rPr>
+        <w:t xml:space="preserve">Requisitos especializados por área de conocimiento</w:t>
+      </w:r>
+    </w:p>
+    <w:p>
+      <w:pPr>
+        <w:spacing w:after="200"/>
+        <w:jc w:val="both"/>
+      </w:pPr>
+      <w:r>
+        <w:rPr/>
+        <w:t xml:space="preserve">Dada la naturaleza especializada de las </w:t>
+      </w:r>
+      <w:r>
+        <w:rPr>
+          <w:b/>
+        </w:rPr>
+        <w:t xml:space="preserve">seis áreas del conocimiento</w:t>
+      </w:r>
+      <w:r>
+        <w:rPr/>
+        <w:t xml:space="preserve"> que conforman la malla curricular 2027 y en cumplimiento de las Normas IES 2 e IES 4 de la IFAC, del Reglamento de Acreditación de la UMSA (Resolución HCU Nº 443/2025) y de los estándares del CEUB, se establecen los siguientes perfiles y titulaciones requeridas:</w:t>
+      </w:r>
+    </w:p>
+    <w:p>
+      <w:pPr>
+        <w:spacing w:after="200"/>
+        <w:jc w:val="both"/>
+      </w:pPr>
+      <w:r>
+        <w:rPr>
+          <w:b/>
+        </w:rPr>
+        <w:t xml:space="preserve">Área de Información Financiera:</w:t>
+      </w:r>
+    </w:p>
+    <w:p>
+      <w:pPr>
+        <w:spacing w:after="200"/>
+        <w:jc w:val="both"/>
+      </w:pPr>
+      <w:r>
+        <w:rPr>
+          <w:b/>
+        </w:rPr>
+        <w:t xml:space="preserve">Requisito Base:</w:t>
+      </w:r>
+    </w:p>
+    <w:p>
+      <w:pPr>
+        <w:numPr>
+          <w:ilvl w:val="0"/>
+          <w:numId w:val="10"/>
+        </w:numPr>
+        <w:spacing w:after="160"/>
+        <w:jc w:val="both"/>
+      </w:pPr>
+      <w:r>
+        <w:rPr/>
+        <w:t xml:space="preserve">Licenciatura en Contaduría Pública / Auditoría con Título en Provisión Nacional de Auditor Financiero / Contador Público Autorizado.</w:t>
+      </w:r>
+    </w:p>
+    <w:p>
+      <w:pPr>
+        <w:numPr>
+          <w:ilvl w:val="0"/>
+          <w:numId w:val="10"/>
+        </w:numPr>
+        <w:spacing w:after="160"/>
+        <w:jc w:val="both"/>
+      </w:pPr>
+      <w:r>
+        <w:rPr/>
+        <w:t xml:space="preserve">Experiencia práctica comprobada en aplicación de NCGA en Bolivia, Normas NIIF de Contabilidad, NIIF para las PYMES, Sistema Básico de Contabilidad Gubernamental Integrada y NICSP.</w:t>
+      </w:r>
+    </w:p>
+    <w:p>
+      <w:pPr>
+        <w:spacing w:after="200"/>
+        <w:jc w:val="both"/>
+      </w:pPr>
+      <w:r>
+        <w:rPr>
+          <w:b/>
+        </w:rPr>
+        <w:t xml:space="preserve">Asignaturas con Perfil Cruzado o Especializado:</w:t>
+      </w:r>
+    </w:p>
+    <w:p>
+      <w:pPr>
+        <w:numPr>
+          <w:ilvl w:val="0"/>
+          <w:numId w:val="10"/>
+        </w:numPr>
+        <w:spacing w:after="160"/>
+        <w:jc w:val="both"/>
+      </w:pPr>
+      <w:r>
+        <w:rPr/>
+        <w:t xml:space="preserve">CPA-102 Herramientas Digitales y CPA-305 Sistemas ERP y Analítica: Licenciatura en Contaduría Pública / Auditoría con Título en Provisión Nacional de Auditor Financiero / Contador Público Autorizado con Posgrado en el área de Informática / TIC; o Licenciatura en Informática / Ingeniería de Sistemas con Título en Provisión Nacional correspondiente con Posgrado en Contaduría Pública / Auditoría.</w:t>
+      </w:r>
+    </w:p>
+    <w:p>
+      <w:pPr>
+        <w:numPr>
+          <w:ilvl w:val="0"/>
+          <w:numId w:val="10"/>
+        </w:numPr>
+        <w:spacing w:after="160"/>
+        <w:jc w:val="both"/>
+      </w:pPr>
+      <w:r>
+        <w:rPr/>
+        <w:t xml:space="preserve">CPA-204 Métodos de Investigación: Licenciatura en Contaduría Pública / Auditoría con Título en Provisión Nacional de Auditor Financiero / Contador Público Autorizado con Posgrado en el área de Investigación; o Licenciatura en Economía y Título en Provisión Nacional de Economista con Posgrado relacionado con el área de Contaduría Pública / Auditoría.</w:t>
+      </w:r>
+    </w:p>
+    <w:p>
+      <w:pPr>
+        <w:spacing w:after="200"/>
+        <w:jc w:val="both"/>
+      </w:pPr>
+      <w:r>
+        <w:rPr>
+          <w:b/>
+        </w:rPr>
+        <w:t xml:space="preserve">Área de Servicios de Aseguramiento:</w:t>
+      </w:r>
+    </w:p>
+    <w:p>
+      <w:pPr>
+        <w:spacing w:after="200"/>
+        <w:jc w:val="both"/>
+      </w:pPr>
+      <w:r>
+        <w:rPr>
+          <w:b/>
+        </w:rPr>
+        <w:t xml:space="preserve">Requisito Base:</w:t>
+      </w:r>
+    </w:p>
+    <w:p>
+      <w:pPr>
+        <w:numPr>
+          <w:ilvl w:val="0"/>
+          <w:numId w:val="10"/>
+        </w:numPr>
+        <w:spacing w:after="160"/>
+        <w:jc w:val="both"/>
+      </w:pPr>
+      <w:r>
+        <w:rPr/>
+        <w:t xml:space="preserve">Licenciatura en Contaduría Pública / Auditoría con Título en Provisión Nacional de Auditor Financiero o Contador Público Autorizado.</w:t>
+      </w:r>
+    </w:p>
+    <w:p>
+      <w:pPr>
+        <w:numPr>
+          <w:ilvl w:val="0"/>
+          <w:numId w:val="10"/>
+        </w:numPr>
+        <w:spacing w:after="160"/>
+        <w:jc w:val="both"/>
+      </w:pPr>
+      <w:r>
+        <w:rPr/>
+        <w:t xml:space="preserve">Experiencia comprobada en firmas de auditoría o el sector gubernamental.</w:t>
+      </w:r>
+    </w:p>
+    <w:p>
+      <w:pPr>
+        <w:spacing w:after="200"/>
+        <w:jc w:val="both"/>
+      </w:pPr>
+      <w:r>
+        <w:rPr>
+          <w:b/>
+        </w:rPr>
+        <w:t xml:space="preserve">Asignaturas Especializadas del Área:</w:t>
+      </w:r>
+    </w:p>
+    <w:p>
+      <w:pPr>
+        <w:numPr>
+          <w:ilvl w:val="0"/>
+          <w:numId w:val="10"/>
+        </w:numPr>
+        <w:spacing w:after="160"/>
+        <w:jc w:val="both"/>
+      </w:pPr>
+      <w:r>
+        <w:rPr/>
+        <w:t xml:space="preserve">CPA-505 Auditoría Digital y Ciberseguridad: Licenciatura en Contaduría Pública / Auditoría con Título en Provisión Nacional de Auditor Financiero o Contador Público Autorizado con Posgrado en Auditoría de Sistemas / Ciberseguridad / TIC; o Licenciatura en Informática / Ingeniería de Sistemas con Título en Provisión Nacional correspondiente con Posgrado relacionado con el área de Contaduría Pública / Auditoría.</w:t>
+      </w:r>
+    </w:p>
+    <w:p>
+      <w:pPr>
+        <w:numPr>
+          <w:ilvl w:val="0"/>
+          <w:numId w:val="10"/>
+        </w:numPr>
+        <w:spacing w:after="160"/>
+        <w:jc w:val="both"/>
+      </w:pPr>
+      <w:r>
+        <w:rPr/>
+        <w:t xml:space="preserve">CPA-506 Reportes y Aseguramiento de Sostenibilidad: Licenciatura en Contaduría Pública / Auditoría con Título en Provisión Nacional de Auditor Financiero o Contador Público Autorizado con Posgrado en Sostenibilidad, ESG, NIEA 3000 o NIAS 5000.</w:t>
+      </w:r>
+    </w:p>
+    <w:p>
+      <w:pPr>
+        <w:numPr>
+          <w:ilvl w:val="0"/>
+          <w:numId w:val="10"/>
+        </w:numPr>
+        <w:spacing w:after="160"/>
+        <w:jc w:val="both"/>
+      </w:pPr>
+      <w:r>
+        <w:rPr/>
+        <w:t xml:space="preserve">CPA-508 Auditoría Forense y Peritajes: Licenciatura en Contaduría Pública / Auditoría con Título en Provisión Nacional de Auditor Financiero o Contador Público Autorizado con Posgrado acreditado en Auditoría Forense, Peritaje o Delitos Económicos.</w:t>
+      </w:r>
+    </w:p>
+    <w:p>
+      <w:pPr>
+        <w:numPr>
+          <w:ilvl w:val="0"/>
+          <w:numId w:val="10"/>
+        </w:numPr>
+        <w:spacing w:after="160"/>
+        <w:jc w:val="both"/>
+      </w:pPr>
+      <w:r>
+        <w:rPr/>
+        <w:t xml:space="preserve">CPA-510 Taller de Grado: Licenciatura en Contaduría Pública / Auditoría con Título en Provisión Nacional de Auditor Financiero o Contador Público Autorizado con Posgrado en el área de investigación Científica; o Licenciatura en Economía con Título en Provisión Nacional de Economista con formación de posgrado relacionada con el área de Contaduría Pública / Auditoría; y Trayectoria comprobada como Tutor / Tribunal de Grado.</w:t>
+      </w:r>
+    </w:p>
+    <w:p>
+      <w:pPr>
+        <w:spacing w:after="200"/>
+        <w:jc w:val="both"/>
+      </w:pPr>
+      <w:r>
+        <w:rPr>
+          <w:b/>
+        </w:rPr>
+        <w:t xml:space="preserve">Área de Administración:</w:t>
+      </w:r>
+    </w:p>
+    <w:p>
+      <w:pPr>
+        <w:spacing w:after="200"/>
+        <w:jc w:val="both"/>
+      </w:pPr>
+      <w:r>
+        <w:rPr>
+          <w:b/>
+        </w:rPr>
+        <w:t xml:space="preserve">Requisito Base:</w:t>
+      </w:r>
+    </w:p>
+    <w:p>
+      <w:pPr>
+        <w:numPr>
+          <w:ilvl w:val="0"/>
+          <w:numId w:val="10"/>
+        </w:numPr>
+        <w:spacing w:after="160"/>
+        <w:jc w:val="both"/>
+      </w:pPr>
+      <w:r>
+        <w:rPr>
+          <w:highlight w:val="yellow"/>
+        </w:rPr>
+        <w:t xml:space="preserve">Licenciatura en Administración de Empresas con Título en Provisión Nacional de Administrador de Empresas; o Licenciatura en Contaduría Pública / Auditoría con Título en Provisión Nacional de Auditor Financiero o Contador Público Autorizado </w:t>
+      </w:r>
+      <w:r>
+        <w:rPr>
+          <w:highlight w:val="red"/>
+        </w:rPr>
+        <w:t xml:space="preserve">con Posgrado en el área de administración (al menos diplomado)</w:t>
+      </w:r>
+    </w:p>
+    <w:p>
+      <w:pPr>
+        <w:numPr>
+          <w:ilvl w:val="0"/>
+          <w:numId w:val="10"/>
+        </w:numPr>
+        <w:spacing w:after="160"/>
+        <w:jc w:val="both"/>
+      </w:pPr>
+      <w:r>
+        <w:rPr/>
+        <w:t xml:space="preserve">Experiencia comprobada en desarrollo organizacional y gestión de sistemas gerenciales.</w:t>
+      </w:r>
+    </w:p>
+    <w:p>
+      <w:pPr>
+        <w:spacing w:after="200"/>
+        <w:jc w:val="both"/>
+      </w:pPr>
+      <w:r>
+        <w:rPr>
+          <w:b/>
+        </w:rPr>
+        <w:t xml:space="preserve">Área de Derecho:</w:t>
+      </w:r>
+    </w:p>
+    <w:p>
+      <w:pPr>
+        <w:spacing w:after="200"/>
+        <w:jc w:val="both"/>
+      </w:pPr>
+      <w:r>
+        <w:rPr>
+          <w:b/>
+          <w:highlight w:val="green"/>
+        </w:rPr>
+        <w:t xml:space="preserve">Asignaturas Especializadas del Área:</w:t>
+      </w:r>
+    </w:p>
+    <w:p>
+      <w:pPr>
+        <w:numPr>
+          <w:ilvl w:val="0"/>
+          <w:numId w:val="10"/>
+        </w:numPr>
+        <w:spacing w:after="160"/>
+        <w:jc w:val="both"/>
+      </w:pPr>
+      <w:r>
+        <w:rPr>
+          <w:highlight w:val="green"/>
+        </w:rPr>
+        <w:t xml:space="preserve">DER-101 Derecho Comercial y Corporativo y DER-102 Derecho Laboral y Seguridad Social: Licenciatura en Derecho con Título en Provisión Nacional de Abogado.</w:t>
+      </w:r>
+    </w:p>
+    <w:p>
+      <w:pPr>
+        <w:numPr>
+          <w:ilvl w:val="0"/>
+          <w:numId w:val="10"/>
+        </w:numPr>
+        <w:spacing w:after="160"/>
+        <w:jc w:val="both"/>
+      </w:pPr>
+      <w:r>
+        <w:rPr>
+          <w:highlight w:val="green"/>
+        </w:rPr>
+        <w:t xml:space="preserve">DER-201 Derecho Tributario y Legislación Aduanera: Licenciatura en Derecho con Título en Provisión Nacional de Abogado con Posgrado en el área de tributación; o Licenciatura en Contaduría Pública / Auditoría con Título en Provisión Nacional de Auditor Financiero o Contador Público Autorizado con Posgrado en el área de tributación. </w:t>
+      </w:r>
+      <w:r>
+        <w:rPr>
+          <w:highlight w:val="red"/>
+        </w:rPr>
+        <w:t xml:space="preserve">(Al menos diplomado en tributación)</w:t>
+      </w:r>
+    </w:p>
+    <w:p>
+      <w:pPr>
+        <w:numPr>
+          <w:ilvl w:val="0"/>
+          <w:numId w:val="10"/>
+        </w:numPr>
+        <w:spacing w:after="160"/>
+        <w:jc w:val="both"/>
+      </w:pPr>
+      <w:r>
+        <w:rPr/>
+        <w:t xml:space="preserve">Experiencia profesional probada relacionada con la asignatura a la que postulan.</w:t>
+      </w:r>
+    </w:p>
+    <w:p>
+      <w:pPr>
+        <w:spacing w:after="200"/>
+        <w:jc w:val="both"/>
+      </w:pPr>
+      <w:r>
+        <w:rPr>
+          <w:b/>
+        </w:rPr>
+        <w:t xml:space="preserve">Área de Economía:</w:t>
+      </w:r>
+    </w:p>
+    <w:p>
+      <w:pPr>
+        <w:spacing w:after="200"/>
+        <w:jc w:val="both"/>
+      </w:pPr>
+      <w:r>
+        <w:rPr>
+          <w:b/>
+        </w:rPr>
+        <w:t xml:space="preserve">Requisito Base:</w:t>
+      </w:r>
+    </w:p>
+    <w:p>
+      <w:pPr>
+        <w:numPr>
+          <w:ilvl w:val="0"/>
+          <w:numId w:val="10"/>
+        </w:numPr>
+        <w:spacing w:after="160"/>
+        <w:jc w:val="both"/>
+      </w:pPr>
+      <w:r>
+        <w:rPr/>
+        <w:t xml:space="preserve">Licenciatura en Economía con Título en Provisión Nacional de Economista.</w:t>
+      </w:r>
+    </w:p>
+    <w:p>
+      <w:pPr>
+        <w:numPr>
+          <w:ilvl w:val="0"/>
+          <w:numId w:val="10"/>
+        </w:numPr>
+        <w:spacing w:after="160"/>
+        <w:jc w:val="both"/>
+      </w:pPr>
+      <w:r>
+        <w:rPr/>
+        <w:t xml:space="preserve">Experiencia comprobada en análisis micro/macroeconómico y evaluación de proyectos.</w:t>
+      </w:r>
+    </w:p>
+    <w:p>
+      <w:pPr>
+        <w:spacing w:after="200"/>
+        <w:jc w:val="both"/>
+      </w:pPr>
+      <w:r>
+        <w:rPr>
+          <w:b/>
+        </w:rPr>
+        <w:t xml:space="preserve">Área de Matemáticas:</w:t>
+      </w:r>
+    </w:p>
+    <w:p>
+      <w:pPr>
+        <w:spacing w:after="200"/>
+        <w:jc w:val="both"/>
+      </w:pPr>
+      <w:r>
+        <w:rPr>
+          <w:b/>
+        </w:rPr>
+        <w:t xml:space="preserve">Requisito Base:</w:t>
+      </w:r>
+    </w:p>
+    <w:p>
+      <w:pPr>
+        <w:numPr>
+          <w:ilvl w:val="0"/>
+          <w:numId w:val="10"/>
+        </w:numPr>
+        <w:spacing w:after="160"/>
+        <w:jc w:val="both"/>
+      </w:pPr>
+      <w:r>
+        <w:rPr/>
+        <w:t xml:space="preserve">Licenciatura en Contaduría Pública / Auditoría, Matemáticas, Estadística o Economía con Título en Provisión Nacional correspondiente, con especialización en métodos cuantitativos aplicados a los negocios y finanzas (cálculo actuarial, estadística y programación operativa).</w:t>
+      </w:r>
+    </w:p>
+    <w:p>
+      <w:pPr>
+        <w:numPr>
+          <w:ilvl w:val="0"/>
+          <w:numId w:val="10"/>
+        </w:numPr>
+        <w:spacing w:after="160"/>
+        <w:jc w:val="both"/>
+      </w:pPr>
+      <w:r>
+        <w:rPr/>
+        <w:t xml:space="preserve">Experiencia profesional probada relacionada con la asignatura a la que postulan.</w:t>
+      </w:r>
+    </w:p>
+    <w:p>
+      <w:pPr>
+        <w:spacing w:after="200"/>
+        <w:jc w:val="both"/>
+      </w:pPr>
+      <w:r>
+        <w:rPr/>
+        <w:t xml:space="preserve">Los </w:t>
+      </w:r>
+      <w:r>
+        <w:rPr>
+          <w:b/>
+        </w:rPr>
+        <w:t xml:space="preserve">Docentes Titulares </w:t>
+      </w:r>
+      <w:r>
+        <w:rPr/>
+        <w:t xml:space="preserve">en ejercicio, antes de la aplicación del Plan de Estudios 2027, conservan la cátedra.</w:t>
+      </w:r>
+    </w:p>
+    <w:p>
+      <w:pPr>
+        <w:keepNext/>
+        <w:spacing w:before="80" w:after="200"/>
+      </w:pPr>
+      <w:r>
+        <w:rPr>
+          <w:b/>
+          <w:sz w:val="20"/>
+          <w:szCs w:val="20"/>
+        </w:rPr>
+        <w:t xml:space="preserve">Mecanismos de Selección, Permanencia y Capacitación Continua</w:t>
+      </w:r>
+    </w:p>
+    <w:p>
+      <w:pPr>
+        <w:spacing w:after="200"/>
+        <w:jc w:val="both"/>
+      </w:pPr>
+      <w:r>
+        <w:rPr/>
+        <w:t xml:space="preserve">En conformidad con la normativa de la UMSA y el CEUB, el plantel docente se administra bajo los siguientes criterios institucionales:</w:t>
+      </w:r>
+    </w:p>
+    <w:p>
+      <w:pPr>
+        <w:numPr>
+          <w:ilvl w:val="0"/>
+          <w:numId w:val="10"/>
+        </w:numPr>
+        <w:spacing w:after="160"/>
+        <w:jc w:val="both"/>
+      </w:pPr>
+      <w:r>
+        <w:rPr>
+          <w:b/>
+        </w:rPr>
+        <w:t xml:space="preserve">Ingreso y Admisión (Concurso de Méritos y Examen de Competencia):</w:t>
+      </w:r>
+      <w:r>
+        <w:rPr/>
+        <w:t xml:space="preserve"> La incorporación de nuevos docentes ordinarios/titulares se realiza mediante convocatoria pública transparente a Concurso de Méritos y Examen de Competencia Público ante comisiones evaluadoras paritarias.</w:t>
+      </w:r>
+    </w:p>
+    <w:p>
+      <w:pPr>
+        <w:numPr>
+          <w:ilvl w:val="0"/>
+          <w:numId w:val="10"/>
+        </w:numPr>
+        <w:spacing w:after="160"/>
+        <w:jc w:val="both"/>
+      </w:pPr>
+      <w:r>
+        <w:rPr>
+          <w:b/>
+        </w:rPr>
+        <w:t xml:space="preserve">Capacitación Docente Continua:</w:t>
+      </w:r>
+      <w:r>
+        <w:rPr/>
+        <w:t xml:space="preserve"> La Dirección de Carrera e instancias universitarias mantendrán un programa permanente de actualización pedagógica y técnica obligatoria en: Tecnologías Emergentes (IA generativa, análisis de datos en Power BI/Python y ERPs); Estándares Internacionales (Normas NIIF de Contabilidad, NIIF para las PYMES, Normas NIIF de Sostenibilidad y pronunciamientos del IAASB); y Estrategias de Didáctica por Competencias y Evaluación Auténtica.</w:t>
+      </w:r>
+    </w:p>
+    <w:p>
+      <w:pPr>
+        <w:numPr>
+          <w:ilvl w:val="0"/>
+          <w:numId w:val="10"/>
+        </w:numPr>
+        <w:spacing w:after="160"/>
+        <w:jc w:val="both"/>
+      </w:pPr>
+      <w:r>
+        <w:rPr>
+          <w:b/>
+        </w:rPr>
+        <w:t xml:space="preserve">Producción Intelectual y Tutorías:</w:t>
+      </w:r>
+      <w:r>
+        <w:rPr/>
+        <w:t xml:space="preserve"> Se valora y fomenta la elaboración de guías de estudio, textos académicos, artículos de investigación aplicada y la dirección activa de Trabajos Dirigidos, Proyectos de Grado y Tesis de Grado.</w:t>
       </w:r>
     </w:p>
     <w:p>

</xml_diff>